<commit_message>
Drop the Room/Direction header from Word detailed analysis.
Match the PDF layout so section 5 shows each room title and analysis without a table header.
</commit_message>
<xml_diff>
--- a/app/services/templates/report_en.docx
+++ b/app/services/templates/report_en.docx
@@ -1408,100 +1408,6 @@
           </w:tblGrid>
         </w:tblGridChange>
       </w:tblGrid>
-      <w:tr>
-        <w:trPr>
-          <w:cantSplit w:val="0"/>
-          <w:tblHeader w:val="0"/>
-        </w:trPr>
-        <w:tc>
-          <w:tcPr>
-            <w:tcBorders>
-              <w:top w:color="e4d8cb" w:space="0" w:sz="4" w:val="single"/>
-              <w:left w:color="e4d8cb" w:space="0" w:sz="4" w:val="single"/>
-              <w:bottom w:color="e4d8cb" w:space="0" w:sz="4" w:val="single"/>
-              <w:right w:color="e4d8cb" w:space="0" w:sz="4" w:val="single"/>
-            </w:tcBorders>
-            <w:shd w:fill="5b3a22" w:val="clear"/>
-            <w:tcMar>
-              <w:top w:w="80.0" w:type="dxa"/>
-              <w:left w:w="120.0" w:type="dxa"/>
-              <w:bottom w:w="80.0" w:type="dxa"/>
-              <w:right w:w="120.0" w:type="dxa"/>
-            </w:tcMar>
-            <w:vAlign w:val="top"/>
-          </w:tcPr>
-          <w:p>
-            <w:pPr>
-              <w:spacing w:after="60" w:before="0" w:lineRule="auto"/>
-              <w:jc w:val="left"/>
-              <w:rPr/>
-            </w:pPr>
-            <w:r>
-              <w:rPr>
-                <w:rFonts w:ascii="Arial" w:cs="Arial" w:eastAsia="Arial" w:hAnsi="Arial"/>
-                <w:b w:val="1"/>
-                <w:bCs w:val="1"/>
-                <w:i w:val="0"/>
-                <w:iCs w:val="0"/>
-                <w:color w:val="ffffff"/>
-                <w:sz w:val="20"/>
-                <w:szCs w:val="20"/>
-                <w:rtl w:val="0"/>
-              </w:rPr>
-              <w:t xml:space="preserve">Room / Direction</w:t>
-            </w:r>
-            <w:r>
-              <w:rPr>
-                <w:rtl w:val="0"/>
-              </w:rPr>
-            </w:r>
-          </w:p>
-        </w:tc>
-        <w:tc>
-          <w:tcPr>
-            <w:tcBorders>
-              <w:top w:color="e4d8cb" w:space="0" w:sz="4" w:val="single"/>
-              <w:left w:color="e4d8cb" w:space="0" w:sz="4" w:val="single"/>
-              <w:bottom w:color="e4d8cb" w:space="0" w:sz="4" w:val="single"/>
-              <w:right w:color="e4d8cb" w:space="0" w:sz="4" w:val="single"/>
-            </w:tcBorders>
-            <w:shd w:fill="5b3a22" w:val="clear"/>
-            <w:tcMar>
-              <w:top w:w="80.0" w:type="dxa"/>
-              <w:left w:w="120.0" w:type="dxa"/>
-              <w:bottom w:w="80.0" w:type="dxa"/>
-              <w:right w:w="120.0" w:type="dxa"/>
-            </w:tcMar>
-            <w:vAlign w:val="top"/>
-          </w:tcPr>
-          <w:p>
-            <w:pPr>
-              <w:spacing w:after="60" w:before="0" w:lineRule="auto"/>
-              <w:jc w:val="left"/>
-              <w:rPr/>
-            </w:pPr>
-            <w:r>
-              <w:rPr>
-                <w:rFonts w:ascii="Arial" w:cs="Arial" w:eastAsia="Arial" w:hAnsi="Arial"/>
-                <w:b w:val="1"/>
-                <w:bCs w:val="1"/>
-                <w:i w:val="0"/>
-                <w:iCs w:val="0"/>
-                <w:color w:val="ffffff"/>
-                <w:sz w:val="20"/>
-                <w:szCs w:val="20"/>
-                <w:rtl w:val="0"/>
-              </w:rPr>
-              <w:t xml:space="preserve">Room / Direction</w:t>
-            </w:r>
-            <w:r>
-              <w:rPr>
-                <w:rtl w:val="0"/>
-              </w:rPr>
-            </w:r>
-          </w:p>
-        </w:tc>
-      </w:tr>
       <w:tr>
         <w:trPr>
           <w:cantSplit w:val="0"/>

</xml_diff>